<commit_message>
Sync the canonical prompt docx now that Word has released it
The last two prompt corrections — the 265 floor and the illustrative transcript
panel — reached the markdown but not the docx, because python-docx could not
open a file Word had locked. Same content, both formats, regenerated from the
one generator so they cannot disagree.

Co-Authored-By: Claude Opus 5 <noreply@anthropic.com>
Claude-Session: https://claude.ai/code/session_01M4Z6V3c3eMgko9FCs2dnki
</commit_message>
<xml_diff>
--- a/docs/brand/BLOG-HERO-PROMPTS.docx
+++ b/docs/brand/BLOG-HERO-PROMPTS.docx
@@ -141,11 +141,28 @@
         <w:t>brighter or more filled than earlier ones.</w:t>
         <w:br/>
         <w:br/>
-        <w:t>Left half: the headline, and beneath it three or four lines of small dim transcript-style</w:t>
-        <w:br/>
-        <w:t>text suggesting the stored answers the plan is built from, with one short line highlighted</w:t>
-        <w:br/>
-        <w:t>in green to imply a passage being lifted as evidence.</w:t>
+        <w:t>Left half: the headline, and beneath it a small panel of dim transcript-style text</w:t>
+        <w:br/>
+        <w:t>suggesting the stored answers the plan is built from, with one short line highlighted in</w:t>
+        <w:br/>
+        <w:t>green to imply a passage being lifted as evidence.</w:t>
+        <w:br/>
+        <w:br/>
+        <w:t>THE TRANSCRIPT PANEL IS ILLUSTRATIVE AND MUST SAY SO. Head it with the words</w:t>
+        <w:br/>
+        <w:t>TRANSCRIPT · ILLUSTRATIVE, not "stored response" and not "live". The lines inside are</w:t>
+        <w:br/>
+        <w:t>invented filler standing in for a real stored answer, so the panel must not present itself</w:t>
+        <w:br/>
+        <w:t>as a record of anything. Set the body lines dim enough to read as texture rather than as</w:t>
+        <w:br/>
+        <w:t>content — legible as shape, not as a quotable claim. Give them no line numbers, no</w:t>
+        <w:br/>
+        <w:t>timestamps and no figures of any kind; a crisp, numbered, fully legible transcript reads as</w:t>
+        <w:br/>
+        <w:t>real evidence, and inventing evidence is the one thing this company cannot do in a picture</w:t>
+        <w:br/>
+        <w:t>about evidence.</w:t>
         <w:br/>
         <w:br/>
         <w:t>Eyebrow top-left: AEO ANALYZERS · WHAT YOU ACTUALLY GET</w:t>
@@ -153,9 +170,9 @@
         <w:br/>
         <w:t>NUMBERS. The only numerals in this image are the card numbers 1 to 5, which are labels.</w:t>
         <w:br/>
-        <w:t>Do not render any percentage, score, count, price or rating anywhere, and do not invent a</w:t>
-        <w:br/>
-        <w:t>figure to fill a card.</w:t>
+        <w:t>Do not render any percentage, score, count, price, rating, line number or date anywhere —</w:t>
+        <w:br/>
+        <w:t>including inside the transcript panel — and do not invent a figure to fill a card.</w:t>
         <w:br/>
         <w:br/>
         <w:t>EXACT VISIBLE TEXT — render each item exactly once:</w:t>
@@ -306,18 +323,28 @@
         <w:t>Eyebrow top-left: AEO ANALYZERS · HONEST-ZERO, PART 2</w:t>
         <w:br/>
         <w:br/>
-        <w:t>NUMBERS. Render the numeral 265 once, large and white, over the grey field. Render no</w:t>
-        <w:br/>
-        <w:t>other numeral anywhere — no percentages, no counts, no axis values.</w:t>
+        <w:t>NUMBERS. Render the numeral 265 once, large and white, over the grey field, with the</w:t>
+        <w:br/>
+        <w:t>words AT LEAST set small directly above it — the telemetry behind this figure dropped</w:t>
+        <w:br/>
+        <w:t>writes, so it is a FLOOR and not an exact count, and a bare 265 would overstate what we</w:t>
+        <w:br/>
+        <w:t>can prove. A dropped write can only lose a crawl, never invent one. Render no other</w:t>
+        <w:br/>
+        <w:t>numeral anywhere — no percentages, no counts, no axis values.</w:t>
         <w:br/>
         <w:br/>
         <w:t>EXACT VISIBLE TEXT — render each item exactly once:</w:t>
         <w:br/>
         <w:t>AEO ANALYZERS · HONEST-ZERO, PART 2</w:t>
         <w:br/>
+        <w:t>AT LEAST</w:t>
+        <w:br/>
         <w:t>265</w:t>
         <w:br/>
         <w:t>CRAWLER VISITS IN TEN DAYS</w:t>
+        <w:br/>
+        <w:t>A floor, not an exact count — the telemetry dropped writes.</w:t>
         <w:br/>
         <w:t>CITED</w:t>
         <w:br/>

</xml_diff>

<commit_message>
Prompt 5: a designed OG card for /evidence
The ledger page shipped with a text-only fallback card. This is the prompt for
a proper one. It is the only card in the set allowed to carry numbers, because
the two it carries — 80% found by name of 40, 0% recommended of 200 — are
published, recomputed from stored transcripts by the publication gate, and
restated here in the page's own words. It carries exactly those and nothing
else: no dates, no engine count, and explicitly no arrow or month-over-month
delta, because an arrow promises a direction the next measurement may not
deliver. The empty clay bar stays empty.

Co-Authored-By: Claude Fable 5.1 <noreply@anthropic.com>
Claude-Session: https://claude.ai/code/session_01M4Z6V3c3eMgko9FCs2dnki
</commit_message>
<xml_diff>
--- a/docs/brand/BLOG-HERO-PROMPTS.docx
+++ b/docs/brand/BLOG-HERO-PROMPTS.docx
@@ -726,6 +726,175 @@
         <w:t>It is not decoration and it must be legible: the image is allowed to carry that number only</w:t>
         <w:br/>
         <w:t>because it carries the caveat with it.</w:t>
+      </w:r>
+    </w:p>
+    <w:p>
+      <w:r>
+        <w:br w:type="page"/>
+      </w:r>
+    </w:p>
+    <w:p>
+      <w:pPr>
+        <w:pStyle w:val="Heading1"/>
+      </w:pPr>
+      <w:r>
+        <w:t>OG card — The Honest-Zero ledger (/evidence) · 1200 x 630 landscape</w:t>
+      </w:r>
+    </w:p>
+    <w:p>
+      <w:r>
+        <w:rPr>
+          <w:i/>
+        </w:rPr>
+        <w:t>Complete prompt — copy everything below this line.</w:t>
+      </w:r>
+    </w:p>
+    <w:p>
+      <w:pPr>
+        <w:spacing w:after="200"/>
+        <w:ind w:left="216"/>
+      </w:pPr>
+      <w:r>
+        <w:rPr>
+          <w:rFonts w:ascii="Consolas" w:hAnsi="Consolas"/>
+          <w:sz w:val="18"/>
+        </w:rPr>
+        <w:t>BRAND SYSTEM — AEO Analyzers. Follow exactly.</w:t>
+        <w:br/>
+        <w:br/>
+        <w:t>PALETTE, exclusive. Background near-black #000603, with a subtle radial lift toward the</w:t>
+        <w:br/>
+        <w:t>centre no more than two stops lighter. Primary and dominant accent bright green #68E66D —</w:t>
+        <w:br/>
+        <w:t>the image must read as a green image at a glance. Supporting accents, used only where they</w:t>
+        <w:br/>
+        <w:t>carry meaning: amber #E8B23C for partial or tier-dependent states, clay #F2705C for absent</w:t>
+        <w:br/>
+        <w:t>or missing, neutral grey-teal #9DB2B7 for inert structure, grids and unlabelled shapes.</w:t>
+        <w:br/>
+        <w:t>All type pure white #FFFFFF, secondary type white at 70% opacity. NO BLUE AND NO TEAL</w:t>
+        <w:br/>
+        <w:t>ANYWHERE.</w:t>
+        <w:br/>
+        <w:br/>
+        <w:t>TYPE. Headlines in a heavy geometric grotesque, tight tracking, sentence case. Never a</w:t>
+        <w:br/>
+        <w:t>serif. Labels and eyebrows in UPPERCASE with wide letter-spacing of about 0.18em, small,</w:t>
+        <w:br/>
+        <w:t>white.</w:t>
+        <w:br/>
+        <w:br/>
+        <w:t>GRAPHIC LANGUAGE — use it, do not minimise it. Dimensional cards with soft shadow and a</w:t>
+        <w:br/>
+        <w:t>1px coloured edge. Outlined bars with partial fill and a visible numeric value. A circular</w:t>
+        <w:br/>
+        <w:t>score ring with a coloured arc and a large white numeral. Fragments of answer-transcript</w:t>
+        <w:br/>
+        <w:t>text set small and dim, suggesting the evidence behind a number. Thin connector lines.</w:t>
+        <w:br/>
+        <w:t>Crisp geometric grids. Detail and density are wanted; this is a reference graphic, not a</w:t>
+        <w:br/>
+        <w:t>minimal poster.</w:t>
+        <w:br/>
+        <w:br/>
+        <w:t>DEPTH ALLOWED. Soft drop shadows, a gentle radial vignette, one plane sitting above</w:t>
+        <w:br/>
+        <w:t>another. NOT ALLOWED: neon glow, bevels, 3-D extrusion, lens flare, photography, stock</w:t>
+        <w:br/>
+        <w:t>imagery, gradients used as decoration.</w:t>
+        <w:br/>
+        <w:br/>
+        <w:t>NEVER INCLUDE. Shields, padlocks, circuit boards, robot faces, brains, magnifying glasses,</w:t>
+        <w:br/>
+        <w:t>speedometers, podiums, trophies, stars, rating badges, medals, competitor logos, competitor</w:t>
+        <w:br/>
+        <w:t>names anywhere in the artwork, or any call-to-action button.</w:t>
+        <w:br/>
+        <w:br/>
+        <w:t>REQUIRED FURNITURE. Eyebrow top-left in UPPERCASE letterspaced white. A thin green #68E66D</w:t>
+        <w:br/>
+        <w:t>hairline rule across the lower third. The words AEO ANALYZERS lower-left and</w:t>
+        <w:br/>
+        <w:t>AEOANALYZERS.COM lower-right, both UPPERCASE letterspaced white and small.</w:t>
+        <w:br/>
+        <w:br/>
+        <w:t>TEXT DISCIPLINE. Every word rendered must be spelled exactly as written below. High</w:t>
+        <w:br/>
+        <w:t>contrast, readable at thumbnail size. Nothing decorative behind type.</w:t>
+        <w:br/>
+        <w:br/>
+        <w:t>COMPOSITION — 1200 x 630 landscape</w:t>
+        <w:br/>
+        <w:br/>
+        <w:t>Social card for the running ledger page. This card is allowed to carry numbers, because the</w:t>
+        <w:br/>
+        <w:t>two it carries are published, recomputed from stored transcripts before every publish, and</w:t>
+        <w:br/>
+        <w:t>restated here in the same words the page uses. It carries exactly those two and nothing else.</w:t>
+        <w:br/>
+        <w:br/>
+        <w:t>Left half: the eyebrow, then a two-line headline, then one sub-line in 70% white.</w:t>
+        <w:br/>
+        <w:br/>
+        <w:t>Right half: two outlined horizontal bars stacked with a clear gap, each with a small</w:t>
+        <w:br/>
+        <w:t>UPPERCASE white label above it and a large white value at its right end.</w:t>
+        <w:br/>
+        <w:t xml:space="preserve">  Top bar: filled 80% of its length in green #68E66D, value 80%, label FOUND BY NAME,</w:t>
+        <w:br/>
+        <w:t xml:space="preserve">  and a tiny secondary line beneath in 70% white reading N=40.</w:t>
+        <w:br/>
+        <w:t xml:space="preserve">  Bottom bar: an EMPTY outline in clay #F2705C with no fill at all, value 0%, label</w:t>
+        <w:br/>
+        <w:t xml:space="preserve">  RECOMMENDED TO BUYERS, secondary line N=200.</w:t>
+        <w:br/>
+        <w:t>The empty bar is the point of the card. Do not add a sliver of fill to make it look better.</w:t>
+        <w:br/>
+        <w:br/>
+        <w:t>NO TREND. Do not draw arrows, sparklines, month-over-month deltas, "up from" text, or any</w:t>
+        <w:br/>
+        <w:t>second set of bars. This is a snapshot of the latest month, not a chart of progress, and an</w:t>
+        <w:br/>
+        <w:t>arrow would promise a direction the next measurement may not deliver.</w:t>
+        <w:br/>
+        <w:br/>
+        <w:t>NUMBERS. Exactly four appear: 80%, N=40, 0%, N=200. Render no other numeral — no dates,</w:t>
+        <w:br/>
+        <w:t>no month counts, no engine counts.</w:t>
+        <w:br/>
+        <w:br/>
+        <w:t>SAFE AREA. Keep every word and both bars inside a margin of 72 pixels on all sides; feeds</w:t>
+        <w:br/>
+        <w:t>crop the edges of a 1200 x 630 card. Check the sub-line at quarter size; if it cannot be read</w:t>
+        <w:br/>
+        <w:t>as a thumbnail, enlarge it rather than shrinking the headline.</w:t>
+        <w:br/>
+        <w:br/>
+        <w:t>EXACT VISIBLE TEXT — render each item exactly once:</w:t>
+        <w:br/>
+        <w:t>AEO ANALYZERS · THE HONEST-ZERO LEDGER</w:t>
+        <w:br/>
+        <w:t>Our own numbers,</w:t>
+        <w:br/>
+        <w:t>every month.</w:t>
+        <w:br/>
+        <w:t>Measured the same way each time. Published whatever it says.</w:t>
+        <w:br/>
+        <w:t>FOUND BY NAME</w:t>
+        <w:br/>
+        <w:t>80%</w:t>
+        <w:br/>
+        <w:t>N=40</w:t>
+        <w:br/>
+        <w:t>RECOMMENDED TO BUYERS</w:t>
+        <w:br/>
+        <w:t>0%</w:t>
+        <w:br/>
+        <w:t>N=200</w:t>
+        <w:br/>
+        <w:t>AEO ANALYZERS</w:t>
+        <w:br/>
+        <w:t>AEOANALYZERS.COM</w:t>
       </w:r>
     </w:p>
     <w:p>

</xml_diff>

<commit_message>
Regenerate BLOG-HERO-PROMPTS with the two One Question prompts
Co-Authored-By: Claude Fable 5.1 <noreply@anthropic.com>
Claude-Session: https://claude.ai/code/session_01M4Z6V3c3eMgko9FCs2dnki
</commit_message>
<xml_diff>
--- a/docs/brand/BLOG-HERO-PROMPTS.docx
+++ b/docs/brand/BLOG-HERO-PROMPTS.docx
@@ -911,6 +911,277 @@
         <w:t>0%</w:t>
         <w:br/>
         <w:t>N=200</w:t>
+        <w:br/>
+        <w:t>AEO ANALYZERS</w:t>
+        <w:br/>
+        <w:t>AEOANALYZERS.COM</w:t>
+      </w:r>
+    </w:p>
+    <w:p>
+      <w:r>
+        <w:br w:type="page"/>
+      </w:r>
+    </w:p>
+    <w:p>
+      <w:pPr>
+        <w:pStyle w:val="Heading1"/>
+      </w:pPr>
+      <w:r>
+        <w:t>Blog hero — One question is not a measurement · 1600 x 900 landscape</w:t>
+      </w:r>
+    </w:p>
+    <w:p>
+      <w:r>
+        <w:rPr>
+          <w:i/>
+        </w:rPr>
+        <w:t>Complete prompt — copy everything below this line.</w:t>
+      </w:r>
+    </w:p>
+    <w:p>
+      <w:pPr>
+        <w:spacing w:after="200"/>
+        <w:ind w:left="216"/>
+      </w:pPr>
+      <w:r>
+        <w:rPr>
+          <w:rFonts w:ascii="Consolas" w:hAnsi="Consolas"/>
+          <w:sz w:val="18"/>
+        </w:rPr>
+        <w:t>BRAND SYSTEM — AEO Analyzers. Follow exactly.</w:t>
+        <w:br/>
+        <w:br/>
+        <w:t>PALETTE, exclusive. Background near-black #000603, with a subtle radial lift toward the</w:t>
+        <w:br/>
+        <w:t>centre no more than two stops lighter. Primary and dominant accent bright green #68E66D —</w:t>
+        <w:br/>
+        <w:t>the image must read as a green image at a glance. Supporting accents, used only where they</w:t>
+        <w:br/>
+        <w:t>carry meaning: amber #E8B23C for partial or tier-dependent states, clay #F2705C for absent</w:t>
+        <w:br/>
+        <w:t>or missing, neutral grey-teal #9DB2B7 for inert structure, grids and unlabelled shapes.</w:t>
+        <w:br/>
+        <w:t>All type pure white #FFFFFF, secondary type white at 70% opacity. NO BLUE AND NO TEAL</w:t>
+        <w:br/>
+        <w:t>ANYWHERE.</w:t>
+        <w:br/>
+        <w:br/>
+        <w:t>TYPE. Headlines in a heavy geometric grotesque, tight tracking, sentence case. Never a</w:t>
+        <w:br/>
+        <w:t>serif. Labels and eyebrows in UPPERCASE with wide letter-spacing of about 0.18em, small,</w:t>
+        <w:br/>
+        <w:t>white.</w:t>
+        <w:br/>
+        <w:br/>
+        <w:t>GRAPHIC LANGUAGE — use it, do not minimise it. Dimensional cards with soft shadow and a</w:t>
+        <w:br/>
+        <w:t>1px coloured edge. Outlined bars with partial fill and a visible numeric value. A circular</w:t>
+        <w:br/>
+        <w:t>score ring with a coloured arc and a large white numeral. Fragments of answer-transcript</w:t>
+        <w:br/>
+        <w:t>text set small and dim, suggesting the evidence behind a number. Thin connector lines.</w:t>
+        <w:br/>
+        <w:t>Crisp geometric grids. Detail and density are wanted; this is a reference graphic, not a</w:t>
+        <w:br/>
+        <w:t>minimal poster.</w:t>
+        <w:br/>
+        <w:br/>
+        <w:t>DEPTH ALLOWED. Soft drop shadows, a gentle radial vignette, one plane sitting above</w:t>
+        <w:br/>
+        <w:t>another. NOT ALLOWED: neon glow, bevels, 3-D extrusion, lens flare, photography, stock</w:t>
+        <w:br/>
+        <w:t>imagery, gradients used as decoration.</w:t>
+        <w:br/>
+        <w:br/>
+        <w:t>NEVER INCLUDE. Shields, padlocks, circuit boards, robot faces, brains, magnifying glasses,</w:t>
+        <w:br/>
+        <w:t>speedometers, podiums, trophies, stars, rating badges, medals, competitor logos, competitor</w:t>
+        <w:br/>
+        <w:t>names anywhere in the artwork, or any call-to-action button.</w:t>
+        <w:br/>
+        <w:br/>
+        <w:t>REQUIRED FURNITURE. Eyebrow top-left in UPPERCASE letterspaced white. A thin green #68E66D</w:t>
+        <w:br/>
+        <w:t>hairline rule across the lower third. The words AEO ANALYZERS lower-left and</w:t>
+        <w:br/>
+        <w:t>AEOANALYZERS.COM lower-right, both UPPERCASE letterspaced white and small.</w:t>
+        <w:br/>
+        <w:br/>
+        <w:t>TEXT DISCIPLINE. Every word rendered must be spelled exactly as written below. High</w:t>
+        <w:br/>
+        <w:t>contrast, readable at thumbnail size. Nothing decorative behind type.</w:t>
+        <w:br/>
+        <w:br/>
+        <w:t>COMPOSITION — 1600 x 900 landscape</w:t>
+        <w:br/>
+        <w:br/>
+        <w:t>Editorial infographic, edge to edge, built as ONE CONTRAST: a single quantity on the left, a</w:t>
+        <w:br/>
+        <w:t>grid on the right.</w:t>
+        <w:br/>
+        <w:br/>
+        <w:t>Left third: ONE tall outlined bar in clay #F2705C, empty, with the UPPERCASE label beneath it.</w:t>
+        <w:br/>
+        <w:t>It represents the minute-long test — one question asked twelve times — and it is drawn as one</w:t>
+        <w:br/>
+        <w:t>shape on purpose.</w:t>
+        <w:br/>
+        <w:br/>
+        <w:t>Right two-thirds: a grid of TWELVE equal dimensional cards, three rows of four, each with a</w:t>
+        <w:br/>
+        <w:t>soft shadow and a 1px green #68E66D edge, with the UPPERCASE label beneath. Rows and columns</w:t>
+        <w:br/>
+        <w:t>at equal weight; no card highlighted, filled, checked or crossed — the grid is the argument</w:t>
+        <w:br/>
+        <w:t>that twelve questions on four engines show a shape one question cannot.</w:t>
+        <w:br/>
+        <w:br/>
+        <w:t>Upper left across the top: the eyebrow and the two-line headline.</w:t>
+        <w:br/>
+        <w:br/>
+        <w:t>NO CHARTS AND NO RESULTS. Do not fill any cell, add a check mark, a percentage, a trend, or a</w:t>
+        <w:br/>
+        <w:t>second bar. The image shows the SHAPE of a measurement, not an outcome.</w:t>
+        <w:br/>
+        <w:br/>
+        <w:t>NUMBERS. Exactly the numerals inside the two labels below. Render no other numeral anywhere.</w:t>
+        <w:br/>
+        <w:br/>
+        <w:t>EXACT VISIBLE TEXT — render each item exactly once:</w:t>
+        <w:br/>
+        <w:t>AEO ANALYZERS · CATEGORY EDUCATION</w:t>
+        <w:br/>
+        <w:t>One question is not</w:t>
+        <w:br/>
+        <w:t>a measurement.</w:t>
+        <w:br/>
+        <w:t>1 QUESTION × 12 RUNS</w:t>
+        <w:br/>
+        <w:t>12 QUESTIONS × 4 ENGINES</w:t>
+        <w:br/>
+        <w:t>AEO ANALYZERS</w:t>
+        <w:br/>
+        <w:t>AEOANALYZERS.COM</w:t>
+      </w:r>
+    </w:p>
+    <w:p>
+      <w:r>
+        <w:br w:type="page"/>
+      </w:r>
+    </w:p>
+    <w:p>
+      <w:pPr>
+        <w:pStyle w:val="Heading1"/>
+      </w:pPr>
+      <w:r>
+        <w:t>OG card — One question is not a measurement · 1200 x 630 landscape</w:t>
+      </w:r>
+    </w:p>
+    <w:p>
+      <w:r>
+        <w:rPr>
+          <w:i/>
+        </w:rPr>
+        <w:t>Complete prompt — copy everything below this line.</w:t>
+      </w:r>
+    </w:p>
+    <w:p>
+      <w:pPr>
+        <w:spacing w:after="200"/>
+        <w:ind w:left="216"/>
+      </w:pPr>
+      <w:r>
+        <w:rPr>
+          <w:rFonts w:ascii="Consolas" w:hAnsi="Consolas"/>
+          <w:sz w:val="18"/>
+        </w:rPr>
+        <w:t>BRAND SYSTEM — AEO Analyzers. Follow exactly.</w:t>
+        <w:br/>
+        <w:br/>
+        <w:t>PALETTE, exclusive. Background near-black #000603, with a subtle radial lift toward the</w:t>
+        <w:br/>
+        <w:t>centre no more than two stops lighter. Primary and dominant accent bright green #68E66D —</w:t>
+        <w:br/>
+        <w:t>the image must read as a green image at a glance. Supporting accents, used only where they</w:t>
+        <w:br/>
+        <w:t>carry meaning: amber #E8B23C for partial or tier-dependent states, clay #F2705C for absent</w:t>
+        <w:br/>
+        <w:t>or missing, neutral grey-teal #9DB2B7 for inert structure, grids and unlabelled shapes.</w:t>
+        <w:br/>
+        <w:t>All type pure white #FFFFFF, secondary type white at 70% opacity. NO BLUE AND NO TEAL</w:t>
+        <w:br/>
+        <w:t>ANYWHERE.</w:t>
+        <w:br/>
+        <w:br/>
+        <w:t>TYPE. Headlines in a heavy geometric grotesque, tight tracking, sentence case. Never a</w:t>
+        <w:br/>
+        <w:t>serif. Labels and eyebrows in UPPERCASE with wide letter-spacing of about 0.18em, small,</w:t>
+        <w:br/>
+        <w:t>white.</w:t>
+        <w:br/>
+        <w:br/>
+        <w:t>GRAPHIC LANGUAGE — use it, do not minimise it. Dimensional cards with soft shadow and a</w:t>
+        <w:br/>
+        <w:t>1px coloured edge. Outlined bars with partial fill and a visible numeric value. A circular</w:t>
+        <w:br/>
+        <w:t>score ring with a coloured arc and a large white numeral. Fragments of answer-transcript</w:t>
+        <w:br/>
+        <w:t>text set small and dim, suggesting the evidence behind a number. Thin connector lines.</w:t>
+        <w:br/>
+        <w:t>Crisp geometric grids. Detail and density are wanted; this is a reference graphic, not a</w:t>
+        <w:br/>
+        <w:t>minimal poster.</w:t>
+        <w:br/>
+        <w:br/>
+        <w:t>DEPTH ALLOWED. Soft drop shadows, a gentle radial vignette, one plane sitting above</w:t>
+        <w:br/>
+        <w:t>another. NOT ALLOWED: neon glow, bevels, 3-D extrusion, lens flare, photography, stock</w:t>
+        <w:br/>
+        <w:t>imagery, gradients used as decoration.</w:t>
+        <w:br/>
+        <w:br/>
+        <w:t>NEVER INCLUDE. Shields, padlocks, circuit boards, robot faces, brains, magnifying glasses,</w:t>
+        <w:br/>
+        <w:t>speedometers, podiums, trophies, stars, rating badges, medals, competitor logos, competitor</w:t>
+        <w:br/>
+        <w:t>names anywhere in the artwork, or any call-to-action button.</w:t>
+        <w:br/>
+        <w:br/>
+        <w:t>REQUIRED FURNITURE. Eyebrow top-left in UPPERCASE letterspaced white. A thin green #68E66D</w:t>
+        <w:br/>
+        <w:t>hairline rule across the lower third. The words AEO ANALYZERS lower-left and</w:t>
+        <w:br/>
+        <w:t>AEOANALYZERS.COM lower-right, both UPPERCASE letterspaced white and small.</w:t>
+        <w:br/>
+        <w:br/>
+        <w:t>TEXT DISCIPLINE. Every word rendered must be spelled exactly as written below. High</w:t>
+        <w:br/>
+        <w:t>contrast, readable at thumbnail size. Nothing decorative behind type.</w:t>
+        <w:br/>
+        <w:br/>
+        <w:t>COMPOSITION — 1200 x 630 landscape</w:t>
+        <w:br/>
+        <w:br/>
+        <w:t>The same contrast at social-card scale: left, ONE tall outlined clay #F2705C bar, empty; right, a</w:t>
+        <w:br/>
+        <w:t>grid of twelve equal green-edged #68E66D cards in three rows of four; the two UPPERCASE labels</w:t>
+        <w:br/>
+        <w:t>beneath each; the two-line headline top left. Keep every word inside a 72-pixel margin. No</w:t>
+        <w:br/>
+        <w:t>fills, checks, percentages or trends. Exactly the numerals in the two labels, no others.</w:t>
+        <w:br/>
+        <w:br/>
+        <w:t>EXACT VISIBLE TEXT — render each item exactly once:</w:t>
+        <w:br/>
+        <w:t>AEO ANALYZERS · CATEGORY EDUCATION</w:t>
+        <w:br/>
+        <w:t>One question is not</w:t>
+        <w:br/>
+        <w:t>a measurement.</w:t>
+        <w:br/>
+        <w:t>1 QUESTION × 12 RUNS</w:t>
+        <w:br/>
+        <w:t>12 QUESTIONS × 4 ENGINES</w:t>
         <w:br/>
         <w:t>AEO ANALYZERS</w:t>
         <w:br/>

</xml_diff>

<commit_message>
Repair the prompt generator entry; regenerate the prompt documents
Co-Authored-By: Claude Fable 5.1 <noreply@anthropic.com>
Claude-Session: https://claude.ai/code/session_01M4Z6V3c3eMgko9FCs2dnki
</commit_message>
<xml_diff>
--- a/docs/brand/BLOG-HERO-PROMPTS.docx
+++ b/docs/brand/BLOG-HERO-PROMPTS.docx
@@ -1182,6 +1182,168 @@
         <w:t>1 QUESTION × 12 RUNS</w:t>
         <w:br/>
         <w:t>12 QUESTIONS × 4 ENGINES</w:t>
+        <w:br/>
+        <w:t>AEO ANALYZERS</w:t>
+        <w:br/>
+        <w:t>AEOANALYZERS.COM</w:t>
+      </w:r>
+    </w:p>
+    <w:p>
+      <w:r>
+        <w:br w:type="page"/>
+      </w:r>
+    </w:p>
+    <w:p>
+      <w:pPr>
+        <w:pStyle w:val="Heading1"/>
+      </w:pPr>
+      <w:r>
+        <w:t>OG card — Buyer series roundup (the super post) · 1200 x 630 landscape</w:t>
+      </w:r>
+    </w:p>
+    <w:p>
+      <w:r>
+        <w:rPr>
+          <w:i/>
+        </w:rPr>
+        <w:t>Complete prompt — copy everything below this line.</w:t>
+      </w:r>
+    </w:p>
+    <w:p>
+      <w:pPr>
+        <w:spacing w:after="200"/>
+        <w:ind w:left="216"/>
+      </w:pPr>
+      <w:r>
+        <w:rPr>
+          <w:rFonts w:ascii="Consolas" w:hAnsi="Consolas"/>
+          <w:sz w:val="18"/>
+        </w:rPr>
+        <w:t>BRAND SYSTEM — AEO Analyzers. Follow exactly.</w:t>
+        <w:br/>
+        <w:br/>
+        <w:t>PALETTE, exclusive. Background near-black #000603, with a subtle radial lift toward the</w:t>
+        <w:br/>
+        <w:t>centre no more than two stops lighter. Primary and dominant accent bright green #68E66D —</w:t>
+        <w:br/>
+        <w:t>the image must read as a green image at a glance. Supporting accents, used only where they</w:t>
+        <w:br/>
+        <w:t>carry meaning: amber #E8B23C for partial or tier-dependent states, clay #F2705C for absent</w:t>
+        <w:br/>
+        <w:t>or missing, neutral grey-teal #9DB2B7 for inert structure, grids and unlabelled shapes.</w:t>
+        <w:br/>
+        <w:t>All type pure white #FFFFFF, secondary type white at 70% opacity. NO BLUE AND NO TEAL</w:t>
+        <w:br/>
+        <w:t>ANYWHERE.</w:t>
+        <w:br/>
+        <w:br/>
+        <w:t>TYPE. Headlines in a heavy geometric grotesque, tight tracking, sentence case. Never a</w:t>
+        <w:br/>
+        <w:t>serif. Labels and eyebrows in UPPERCASE with wide letter-spacing of about 0.18em, small,</w:t>
+        <w:br/>
+        <w:t>white.</w:t>
+        <w:br/>
+        <w:br/>
+        <w:t>GRAPHIC LANGUAGE — use it, do not minimise it. Dimensional cards with soft shadow and a</w:t>
+        <w:br/>
+        <w:t>1px coloured edge. Outlined bars with partial fill and a visible numeric value. A circular</w:t>
+        <w:br/>
+        <w:t>score ring with a coloured arc and a large white numeral. Fragments of answer-transcript</w:t>
+        <w:br/>
+        <w:t>text set small and dim, suggesting the evidence behind a number. Thin connector lines.</w:t>
+        <w:br/>
+        <w:t>Crisp geometric grids. Detail and density are wanted; this is a reference graphic, not a</w:t>
+        <w:br/>
+        <w:t>minimal poster.</w:t>
+        <w:br/>
+        <w:br/>
+        <w:t>DEPTH ALLOWED. Soft drop shadows, a gentle radial vignette, one plane sitting above</w:t>
+        <w:br/>
+        <w:t>another. NOT ALLOWED: neon glow, bevels, 3-D extrusion, lens flare, photography, stock</w:t>
+        <w:br/>
+        <w:t>imagery, gradients used as decoration.</w:t>
+        <w:br/>
+        <w:br/>
+        <w:t>NEVER INCLUDE. Shields, padlocks, circuit boards, robot faces, brains, magnifying glasses,</w:t>
+        <w:br/>
+        <w:t>speedometers, podiums, trophies, stars, rating badges, medals, competitor logos, competitor</w:t>
+        <w:br/>
+        <w:t>names anywhere in the artwork, or any call-to-action button.</w:t>
+        <w:br/>
+        <w:br/>
+        <w:t>REQUIRED FURNITURE. Eyebrow top-left in UPPERCASE letterspaced white. A thin green #68E66D</w:t>
+        <w:br/>
+        <w:t>hairline rule across the lower third. The words AEO ANALYZERS lower-left and</w:t>
+        <w:br/>
+        <w:t>AEOANALYZERS.COM lower-right, both UPPERCASE letterspaced white and small.</w:t>
+        <w:br/>
+        <w:br/>
+        <w:t>TEXT DISCIPLINE. Every word rendered must be spelled exactly as written below. High</w:t>
+        <w:br/>
+        <w:t>contrast, readable at thumbnail size. Nothing decorative behind type.</w:t>
+        <w:br/>
+        <w:br/>
+        <w:t>COMPOSITION — 1200 x 630 landscape</w:t>
+        <w:br/>
+        <w:br/>
+        <w:t>Social card for the roundup post that collects the six-part buyer series in one place. The</w:t>
+        <w:br/>
+        <w:t>argument is the SET: six equal reads, laid side by side, none ranked above another.</w:t>
+        <w:br/>
+        <w:br/>
+        <w:t>Left third: the eyebrow, then a two-line headline, then one sub-line in 70% white.</w:t>
+        <w:br/>
+        <w:br/>
+        <w:t>Right two-thirds: a single row of six equal dimensional cards with a 1px grey-teal #9DB2B7</w:t>
+        <w:br/>
+        <w:t>edge, each carrying only its number top-left in green #68E66D and, beneath it, three or four</w:t>
+        <w:br/>
+        <w:t>short dim placeholder text lines in grey-teal that suggest a page of reading. A thin green</w:t>
+        <w:br/>
+        <w:t>connector line runs above the row and drops one short tick to the top of each card. All six</w:t>
+        <w:br/>
+        <w:t>cards are the same size, the same edge colour and the same fill — the reader must not be able</w:t>
+        <w:br/>
+        <w:t>to tell one card is preferred. Do NOT colour any card's contents green, amber or clay, do NOT</w:t>
+        <w:br/>
+        <w:t>add checkmarks, swatches, bars or scores inside the cards, and do NOT draw a play button or</w:t>
+        <w:br/>
+        <w:t>any video symbol anywhere: every item in the series is a written page.</w:t>
+        <w:br/>
+        <w:br/>
+        <w:t>NUMBERS. Exactly the six numerals 1 2 3 4 5 6, one per card, and the word six in the</w:t>
+        <w:br/>
+        <w:t>sub-line. Render no other numeral — no minute counts, no question counts, no dates.</w:t>
+        <w:br/>
+        <w:br/>
+        <w:t>SAFE AREA. Keep every word and all six cards inside a margin of 72 pixels on all sides.</w:t>
+        <w:br/>
+        <w:t>Check the sub-line at quarter size; if it cannot be read as a thumbnail, enlarge it rather</w:t>
+        <w:br/>
+        <w:t>than shrinking the headline.</w:t>
+        <w:br/>
+        <w:br/>
+        <w:t>EXACT VISIBLE TEXT — render each item exactly once:</w:t>
+        <w:br/>
+        <w:t>AEO ANALYZERS · THE BUYER SERIES</w:t>
+        <w:br/>
+        <w:t>Missed the AEO buyer series?</w:t>
+        <w:br/>
+        <w:t>Here is all of it in one place.</w:t>
+        <w:br/>
+        <w:t>Six short reads, written for buyers.</w:t>
+        <w:br/>
+        <w:t>1</w:t>
+        <w:br/>
+        <w:t>2</w:t>
+        <w:br/>
+        <w:t>3</w:t>
+        <w:br/>
+        <w:t>4</w:t>
+        <w:br/>
+        <w:t>5</w:t>
+        <w:br/>
+        <w:t>6</w:t>
         <w:br/>
         <w:t>AEO ANALYZERS</w:t>
         <w:br/>

</xml_diff>

<commit_message>
Roundup prompt: eyebrow spells out Answer Engine Optimization
Co-Authored-By: Claude Fable 5.1 <noreply@anthropic.com>
Claude-Session: https://claude.ai/code/session_01M4Z6V3c3eMgko9FCs2dnki
</commit_message>
<xml_diff>
--- a/docs/brand/BLOG-HERO-PROMPTS.docx
+++ b/docs/brand/BLOG-HERO-PROMPTS.docx
@@ -1291,7 +1291,7 @@
         <w:t>argument is the SET: six equal reads, laid side by side, none ranked above another.</w:t>
         <w:br/>
         <w:br/>
-        <w:t>Left third: the eyebrow, then a two-line headline, then one sub-line in 70% white.</w:t>
+        <w:t>Left third: the eyebrow (it spells the term out for readers who have never met the acronym), then a two-line headline, then one sub-line in 70% white that may wrap to two lines.</w:t>
         <w:br/>
         <w:br/>
         <w:t>Right two-thirds: a single row of six equal dimensional cards with a 1px grey-teal #9DB2B7</w:t>
@@ -1325,13 +1325,13 @@
         <w:br/>
         <w:t>EXACT VISIBLE TEXT — render each item exactly once:</w:t>
         <w:br/>
-        <w:t>AEO ANALYZERS · THE BUYER SERIES</w:t>
+        <w:t>ANSWER ENGINE OPTIMIZATION · THE BUYER SERIES</w:t>
         <w:br/>
         <w:t>Missed the AEO buyer series?</w:t>
         <w:br/>
         <w:t>Here is all of it in one place.</w:t>
         <w:br/>
-        <w:t>Six short reads, written for buyers.</w:t>
+        <w:t>Six short reads on getting AI assistants to recommend your business.</w:t>
         <w:br/>
         <w:t>1</w:t>
         <w:br/>

</xml_diff>